<commit_message>
B5: sửa đề bài tập về nhà theo mẫu B4, dựng lại handout và slide học viên
- De_bai 5 cột (Yêu cầu · Kết quả kỳ vọng · Tự kiểm tra nhanh), 6 việc, thêm BaoCao_LFL
- Nhat_ky_doi_soat mẫu: một lỗi gốc một dòng
- Đồng bộ build_b5_homework.py, build_docs_b5.py, Slide_Script_B5.md
- Dựng lại Handout (docx/pdf) và Slide_B5_HocVien.pptx

Co-Authored-By: Claude Sonnet 5.5 <noreply@anthropic.com>
</commit_message>
<xml_diff>
--- a/1_Sessions/B5_Data_Model_DAX/Handout/B5_Handout.docx
+++ b/1_Sessions/B5_Data_Model_DAX/Handout/B5_Handout.docx
@@ -18,7 +18,7 @@
         <w:pStyle w:val="Heading1"/>
       </w:pPr>
       <w:r>
-        <w:t>Handout Buổi 5 — Data Model và DAX</w:t>
+        <w:t>Handout Buổi 5: Data Model và DAX</w:t>
       </w:r>
     </w:p>
     <w:p>
@@ -28,7 +28,7 @@
           <w:i/>
           <w:color w:val="585858"/>
         </w:rPr>
-        <w:t>Tài liệu tự học đi kèm Buổi 5. Phần Tóm tắt nhắc lại mô hình và 14 measure đã dựng trên lớp; mục 1–8 là công cụ KHÔNG giảng chi tiết trên lớp, đọc sau buổi học rồi làm bài tập về nhà (bắt buộc) ở mục 9. Ví dụ viết trên file đáp án Practice/B5_MCI_Mart_Answer.xlsx. Tên lệnh giữ tiếng Anh như trên Ribbon. Số trong ảnh chụp theo định dạng en-US: dấu phẩy ngăn nghìn, dấu chấm thập phân (425,850,000 trong ảnh là 425.850.000 trong bảng).</w:t>
+        <w:t>Tài liệu tự học đi kèm Buổi 5. Phần Tóm tắt nhắc lại mô hình và 14 measure đã dựng trên lớp; mục 1 mở rộng phần Hide from Client Tools đã làm ở Slide 20, mục 2–8 là công cụ KHÔNG giảng chi tiết trên lớp. Đọc sau buổi học rồi làm bài tập về nhà (bắt buộc) ở mục 9. Ví dụ làm trên BẢN SAO của file đáp án Practice/B5_MCI_Mart_Answer.xlsx (file đáp án là file khởi đầu Buổi 6, giữ nguyên bản gốc). Tên lệnh giữ tiếng Anh như trên Ribbon. Số trong ảnh chụp theo định dạng en-US: dấu phẩy ngăn nghìn, dấu chấm thập phân (425,850,000 trong ảnh là 425.850.000 trong bảng).</w:t>
       </w:r>
     </w:p>
     <w:p>
@@ -964,6 +964,16 @@
       <w:r>
         <w:rPr>
           <w:b w:val="0"/>
+          <w:i w:val="0"/>
+          <w:sz w:val="18"/>
+        </w:rPr>
+        <w:t>Lưu ý Total COGS: file đáp án viết bằng SUMX (mục 5); trên lớp, Total COGS = SUM(Sales[COGS]) trên cột COGS đã tạo ở Slide 15. Hai cách cùng ra 619.663.000.</w:t>
+      </w:r>
+    </w:p>
+    <w:p>
+      <w:r>
+        <w:rPr>
+          <w:b w:val="0"/>
           <w:i/>
           <w:color w:val="585858"/>
         </w:rPr>
@@ -984,7 +994,7 @@
           <w:b w:val="0"/>
           <w:i w:val="0"/>
         </w:rPr>
-        <w:t>Pivot liệt kê mọi cột của mọi bảng. Cột khóa và cột ngày của bảng fact (Store_Code, Order_Date…) rất dễ bị kéo nhầm vào hàng hoặc cột: Pivot vẫn chạy nhưng cho số sai (Target lặp lại, YTD / YoY trống). Giấu chúng đi để chỉ còn cột của bảng lookup trong danh sách.</w:t>
+        <w:t>Slide 20 đã ẩn 9 cột khóa và cột ngày của Sales và Target; mục này nhắc lại cách làm và thêm hai việc chưa làm trên lớp: bỏ cột thừa, giảm granularity. Pivot liệt kê mọi cột của mọi bảng. Cột khóa và cột ngày của bảng fact (Store_Code, Order_Date…) rất dễ bị kéo nhầm vào hàng hoặc cột: Pivot vẫn chạy nhưng cho số sai (Target lặp lại, YTD / YoY trống). Giấu chúng đi để chỉ còn cột của bảng lookup trong danh sách.</w:t>
       </w:r>
     </w:p>
     <w:p>
@@ -1210,7 +1220,7 @@
       <w:r>
         <w:drawing>
           <wp:inline xmlns:a="http://schemas.openxmlformats.org/drawingml/2006/main" xmlns:pic="http://schemas.openxmlformats.org/drawingml/2006/picture">
-            <wp:extent cx="5400000" cy="2227500"/>
+            <wp:extent cx="5400000" cy="2221875"/>
             <wp:docPr id="2" name="Picture 2"/>
             <wp:cNvGraphicFramePr>
               <a:graphicFrameLocks noChangeAspect="1"/>
@@ -1231,7 +1241,7 @@
                   <pic:spPr>
                     <a:xfrm>
                       <a:off x="0" y="0"/>
-                      <a:ext cx="5400000" cy="2227500"/>
+                      <a:ext cx="5400000" cy="2221875"/>
                     </a:xfrm>
                     <a:prstGeom prst="rect"/>
                   </pic:spPr>
@@ -1498,7 +1508,7 @@
           <w:b w:val="0"/>
           <w:i w:val="0"/>
         </w:rPr>
-        <w:t>Data Model chỉ nhận quan hệ một–nhiều (1–*): một đầu là khóa duy nhất (bảng lookup), đầu kia lặp lại (bảng fact). Cả Sales[Store_Code] và Target[Store_Code] đều lặp lại (mỗi cửa hàng có nhiều dòng bán hàng và 12 dòng target) nên không nối được với nhau — đó là quan hệ nhiều–nhiều (many-to-many).</w:t>
+        <w:t>Data Model chỉ nhận quan hệ một–nhiều (1–*): một đầu là khóa duy nhất (bảng lookup), đầu kia lặp lại (bảng fact). Cả Sales[Store_Code] và Target[Store_Code] đều lặp lại (mỗi cửa hàng có nhiều dòng bán hàng và 12 dòng target) nên không nối được với nhau, đó là quan hệ nhiều–nhiều (many-to-many).</w:t>
       </w:r>
     </w:p>
     <w:p>
@@ -3368,7 +3378,7 @@
           <w:i/>
           <w:color w:val="585858"/>
         </w:rPr>
-        <w:t>Cửa hàng dưới 80%: tháng 2 — ST01, ST05, ST08, ST09, ST12; tháng 3 — ST02, ST06, ST07, ST11, ST12; tháng 4 — ST04, ST12. Ở ngưỡng 90% thêm các cửa hàng nằm giữa 80% và 90%.</w:t>
+        <w:t>Cửa hàng dưới 80%: tháng 2: ST01, ST05, ST08, ST09, ST12; tháng 3: ST02, ST06, ST07, ST11, ST12; tháng 4: ST04, ST12. Ở ngưỡng 90% thêm các cửa hàng nằm giữa 80% và 90%.</w:t>
       </w:r>
     </w:p>
     <w:p>
@@ -3476,7 +3486,7 @@
           <w:b w:val="0"/>
           <w:i w:val="0"/>
         </w:rPr>
-        <w:t>https://hocvien.mcivietnam.com/auth#/ — tài khoản như Buổi 4.</w:t>
+        <w:t>https://hocvien.mcivietnam.com/auth#/ (tài khoản như Buổi 4).</w:t>
       </w:r>
     </w:p>
     <w:p>
@@ -3484,7 +3494,7 @@
         <w:pStyle w:val="ListBullet"/>
       </w:pPr>
       <w:r>
-        <w:t>Đối soát báo cáo của Kinh doanh với sheet So_lieu_Tai_chinh; ghi sheet Nhat_ky_doi_soat đủ 4 lỗi: chỉ tiêu, số hai bên, nguyên nhân, cách sửa.</w:t>
+        <w:t>Đối soát: so BaoCao_KinhDoanh với So_lieu_Tai_chinh; ghi Nhat_ky_doi_soat đủ 4 lỗi gốc, mỗi lỗi một dòng: chỉ tiêu, số hai bên, nguyên nhân, cách sửa.</w:t>
       </w:r>
     </w:p>
     <w:p>
@@ -3492,7 +3502,7 @@
         <w:pStyle w:val="ListBullet"/>
       </w:pPr>
       <w:r>
-        <w:t>Sửa mô hình thành hình ngôi sao: nối Target vào Calendar, ẩn cột kỹ thuật của hai bảng fact (mục 1), Mark as Date Table, xóa 6 measure KD …; dán ảnh Diagram View vào Brief_Insight.</w:t>
+        <w:t>Sửa mô hình thành hình ngôi sao: nối Target vào Calendar, ẩn cột kỹ thuật của hai bảng fact (mục 1), Mark as Date Table; dán ảnh Diagram View vào Brief_Insight.</w:t>
       </w:r>
     </w:p>
     <w:p>
@@ -3500,7 +3510,15 @@
         <w:pStyle w:val="ListBullet"/>
       </w:pPr>
       <w:r>
-        <w:t>Viết lại KPI bằng explicit measure theo tầng (measure cơ sở → measure dẫn xuất); thêm like-for-like: Revenue LFL, Revenue LFL LY, YoY LFL %. Dựng lại BaoCao_KinhDoanh từ các measure này.</w:t>
+        <w:t>Viết lại KPI bằng explicit measure theo tầng (measure cơ sở → measure dẫn xuất); thêm like-for-like: Revenue LFL, Revenue LFL LY, YoY LFL %; xóa 6 measure KD.</w:t>
+      </w:r>
+    </w:p>
+    <w:p>
+      <w:pPr>
+        <w:pStyle w:val="ListBullet"/>
+      </w:pPr>
+      <w:r>
+        <w:t>Dựng lại BaoCao_KinhDoanh từ measure của bạn (tháng lấy từ Calendar[Thang]); tạo sheet BaoCao_LFL; đối soát lại với So_lieu_Tai_chinh, chênh lệch phải bằng 0.</w:t>
       </w:r>
     </w:p>
     <w:p>
@@ -3516,7 +3534,7 @@
         <w:pStyle w:val="ListBullet"/>
       </w:pPr>
       <w:r>
-        <w:t>Brief_Insight: 3 câu hỏi đo lường được cho Sales Director (chỉ số, chiều, thời gian, mốc so sánh), mỗi câu trả lời bằng một Pivot từ measure; 1 câu insight (con số – nguyên nhân khả dĩ – hàm ý).</w:t>
+        <w:t>Brief_Insight: 3 câu hỏi đo lường được cho Sales Director (chỉ số, chiều, thời gian, mốc so sánh), mỗi câu trả lời bằng một Pivot từ measure; 1 câu insight (con số, nguyên nhân khả dĩ, hàm ý).</w:t>
       </w:r>
     </w:p>
     <w:p>

</xml_diff>